<commit_message>
avancement sur la doc technique
</commit_message>
<xml_diff>
--- a/Aides/Documents/Documentation Technique(1).docx
+++ b/Aides/Documents/Documentation Technique(1).docx
@@ -124,6 +124,7 @@
       <w:r>
         <w:t xml:space="preserve"> et se trouve dans un fichier </w:t>
       </w:r>
+      <w:proofErr w:type="gramStart"/>
       <w:r>
         <w:rPr>
           <w:rFonts w:ascii="Consolas" w:hAnsi="Consolas"/>
@@ -134,7 +135,14 @@
         <w:rPr>
           <w:rFonts w:ascii="Consolas" w:hAnsi="Consolas"/>
         </w:rPr>
-        <w:t xml:space="preserve"> . </w:t>
+        <w:t xml:space="preserve"> .</w:t>
+      </w:r>
+      <w:proofErr w:type="gramEnd"/>
+      <w:r>
+        <w:rPr>
+          <w:rFonts w:ascii="Consolas" w:hAnsi="Consolas"/>
+        </w:rPr>
+        <w:t xml:space="preserve"> </w:t>
       </w:r>
     </w:p>
     <w:p>
@@ -895,7 +903,7 @@
           <w:noProof/>
         </w:rPr>
         <w:drawing>
-          <wp:inline distT="0" distB="0" distL="0" distR="0" wp14:anchorId="2536718D" wp14:editId="45CBE645">
+          <wp:inline distT="0" distB="0" distL="0" distR="0" wp14:anchorId="2536718D" wp14:editId="7A8244F4">
             <wp:extent cx="3605052" cy="7311390"/>
             <wp:effectExtent l="0" t="0" r="0" b="3810"/>
             <wp:docPr id="1580423978" name="Image 4"/>
@@ -964,7 +972,7 @@
           <w:noProof/>
         </w:rPr>
         <w:drawing>
-          <wp:inline distT="0" distB="0" distL="0" distR="0" wp14:anchorId="6F16F49F" wp14:editId="1A4435AD">
+          <wp:inline distT="0" distB="0" distL="0" distR="0" wp14:anchorId="6F16F49F" wp14:editId="54AFE21D">
             <wp:extent cx="3393592" cy="6838950"/>
             <wp:effectExtent l="0" t="0" r="0" b="0"/>
             <wp:docPr id="1213528569" name="Image 6"/>
@@ -1047,7 +1055,7 @@
         </w:rPr>
         <w:lastRenderedPageBreak/>
         <w:drawing>
-          <wp:inline distT="0" distB="0" distL="0" distR="0" wp14:anchorId="59C7589E" wp14:editId="59227736">
+          <wp:inline distT="0" distB="0" distL="0" distR="0" wp14:anchorId="59C7589E" wp14:editId="3E54C254">
             <wp:extent cx="3538327" cy="7153275"/>
             <wp:effectExtent l="0" t="0" r="5080" b="0"/>
             <wp:docPr id="340219067" name="Image 8"/>
@@ -1255,7 +1263,7 @@
         </w:rPr>
         <w:lastRenderedPageBreak/>
         <w:drawing>
-          <wp:inline distT="0" distB="0" distL="0" distR="0" wp14:anchorId="6F3B94A0" wp14:editId="0F0BF77F">
+          <wp:inline distT="0" distB="0" distL="0" distR="0" wp14:anchorId="6F3B94A0" wp14:editId="6E0E86C2">
             <wp:extent cx="2680244" cy="5529580"/>
             <wp:effectExtent l="0" t="0" r="6350" b="0"/>
             <wp:docPr id="1288727239" name="Image 6"/>
@@ -1619,7 +1627,15 @@
     </w:p>
     <w:p>
       <w:r>
-        <w:t>(capture)</w:t>
+        <w:t>(</w:t>
+      </w:r>
+      <w:proofErr w:type="gramStart"/>
+      <w:r>
+        <w:t>capture</w:t>
+      </w:r>
+      <w:proofErr w:type="gramEnd"/>
+      <w:r>
+        <w:t>)</w:t>
       </w:r>
     </w:p>
     <w:p/>
@@ -2931,10 +2947,12 @@
         </w:tabs>
       </w:pPr>
       <w:proofErr w:type="spellStart"/>
+      <w:proofErr w:type="gramStart"/>
       <w:r>
         <w:t>parseRoles</w:t>
       </w:r>
       <w:proofErr w:type="spellEnd"/>
+      <w:proofErr w:type="gramEnd"/>
       <w:r>
         <w:t xml:space="preserve"> : </w:t>
       </w:r>
@@ -2979,10 +2997,12 @@
         </w:tabs>
       </w:pPr>
       <w:proofErr w:type="spellStart"/>
+      <w:proofErr w:type="gramStart"/>
       <w:r>
         <w:t>resolveAppRole</w:t>
       </w:r>
       <w:proofErr w:type="spellEnd"/>
+      <w:proofErr w:type="gramEnd"/>
       <w:r>
         <w:t> : distinguer les rôles</w:t>
       </w:r>
@@ -3057,30 +3077,15 @@
                         <w:txbxContent>
                           <w:p>
                             <w:r>
-                              <w:t>Ici on prend en paramètre le</w:t>
-                            </w:r>
-                            <w:r>
-                              <w:t xml:space="preserve">s </w:t>
+                              <w:t xml:space="preserve">Ici on prend en paramètre les </w:t>
                             </w:r>
                             <w:proofErr w:type="spellStart"/>
                             <w:r>
-                              <w:t>role</w:t>
-                            </w:r>
-                            <w:r>
-                              <w:t>s</w:t>
+                              <w:t>roles</w:t>
                             </w:r>
                             <w:proofErr w:type="spellEnd"/>
                             <w:r>
-                              <w:t xml:space="preserve"> </w:t>
-                            </w:r>
-                            <w:r>
-                              <w:t>dans son intégralité</w:t>
-                            </w:r>
-                            <w:r>
-                              <w:t>)</w:t>
-                            </w:r>
-                            <w:r>
-                              <w:t xml:space="preserve"> et on ira chercher les différents </w:t>
+                              <w:t xml:space="preserve"> dans son intégralité) et on ira chercher les différents </w:t>
                             </w:r>
                             <w:proofErr w:type="spellStart"/>
                             <w:r>
@@ -3139,30 +3144,15 @@
                   <w:txbxContent>
                     <w:p>
                       <w:r>
-                        <w:t>Ici on prend en paramètre le</w:t>
-                      </w:r>
-                      <w:r>
-                        <w:t xml:space="preserve">s </w:t>
+                        <w:t xml:space="preserve">Ici on prend en paramètre les </w:t>
                       </w:r>
                       <w:proofErr w:type="spellStart"/>
                       <w:r>
-                        <w:t>role</w:t>
-                      </w:r>
-                      <w:r>
-                        <w:t>s</w:t>
+                        <w:t>roles</w:t>
                       </w:r>
                       <w:proofErr w:type="spellEnd"/>
                       <w:r>
-                        <w:t xml:space="preserve"> </w:t>
-                      </w:r>
-                      <w:r>
-                        <w:t>dans son intégralité</w:t>
-                      </w:r>
-                      <w:r>
-                        <w:t>)</w:t>
-                      </w:r>
-                      <w:r>
-                        <w:t xml:space="preserve"> et on ira chercher les différents </w:t>
+                        <w:t xml:space="preserve"> dans son intégralité) et on ira chercher les différents </w:t>
                       </w:r>
                       <w:proofErr w:type="spellStart"/>
                       <w:r>
@@ -3697,10 +3687,12 @@
         <w:t xml:space="preserve"> en une variable les informations nécessaires pour se connecter (</w:t>
       </w:r>
       <w:proofErr w:type="spellStart"/>
+      <w:proofErr w:type="gramStart"/>
       <w:r>
         <w:t>email,password</w:t>
       </w:r>
       <w:proofErr w:type="spellEnd"/>
+      <w:proofErr w:type="gramEnd"/>
       <w:r>
         <w:t>)</w:t>
       </w:r>
@@ -3715,6 +3707,9 @@
         </w:tabs>
       </w:pPr>
       <w:r>
+        <w:rPr>
+          <w:noProof/>
+        </w:rPr>
         <w:drawing>
           <wp:inline distT="0" distB="0" distL="0" distR="0" wp14:anchorId="72D29B89" wp14:editId="14A5D686">
             <wp:extent cx="3658111" cy="533474"/>
@@ -3775,6 +3770,9 @@
         </w:tabs>
       </w:pPr>
       <w:r>
+        <w:rPr>
+          <w:noProof/>
+        </w:rPr>
         <w:drawing>
           <wp:inline distT="0" distB="0" distL="0" distR="0" wp14:anchorId="005F2E9C" wp14:editId="326AAF80">
             <wp:extent cx="5760720" cy="509270"/>
@@ -3819,6 +3817,9 @@
         </w:tabs>
       </w:pPr>
       <w:r>
+        <w:rPr>
+          <w:noProof/>
+        </w:rPr>
         <w:drawing>
           <wp:inline distT="0" distB="0" distL="0" distR="0" wp14:anchorId="23BB9236" wp14:editId="0BF57223">
             <wp:extent cx="5760720" cy="273050"/>
@@ -3882,6 +3883,9 @@
         </w:tabs>
       </w:pPr>
       <w:r>
+        <w:rPr>
+          <w:noProof/>
+        </w:rPr>
         <w:drawing>
           <wp:inline distT="0" distB="0" distL="0" distR="0" wp14:anchorId="7DF3C7CD" wp14:editId="0C44EC9A">
             <wp:extent cx="4163006" cy="228632"/>
@@ -3936,6 +3940,9 @@
         </w:tabs>
       </w:pPr>
       <w:r>
+        <w:rPr>
+          <w:noProof/>
+        </w:rPr>
         <w:lastRenderedPageBreak/>
         <w:drawing>
           <wp:inline distT="0" distB="0" distL="0" distR="0" wp14:anchorId="0C660BBA" wp14:editId="71270104">
@@ -3999,6 +4006,9 @@
         <w:jc w:val="center"/>
       </w:pPr>
       <w:r>
+        <w:rPr>
+          <w:noProof/>
+        </w:rPr>
         <w:drawing>
           <wp:inline distT="0" distB="0" distL="0" distR="0" wp14:anchorId="3B69E0F3" wp14:editId="67E7AAC8">
             <wp:extent cx="2029108" cy="238158"/>
@@ -4052,11 +4062,339 @@
         <w:tabs>
           <w:tab w:val="left" w:pos="5172"/>
         </w:tabs>
+        <w:jc w:val="both"/>
+      </w:pPr>
+    </w:p>
+    <w:p>
+      <w:pPr>
+        <w:tabs>
+          <w:tab w:val="left" w:pos="5172"/>
+        </w:tabs>
+        <w:jc w:val="both"/>
+      </w:pPr>
+      <w:r>
+        <w:t xml:space="preserve">On définit une variable </w:t>
+      </w:r>
+      <w:proofErr w:type="spellStart"/>
+      <w:r>
+        <w:t>normalizedHash</w:t>
+      </w:r>
+      <w:proofErr w:type="spellEnd"/>
+      <w:r>
+        <w:t xml:space="preserve"> qui viendra corriger le format du hash que produit le module </w:t>
+      </w:r>
+      <w:proofErr w:type="spellStart"/>
+      <w:r>
+        <w:t>bcrypt</w:t>
+      </w:r>
+      <w:proofErr w:type="spellEnd"/>
+      <w:r>
+        <w:t xml:space="preserve"> afin de le rendre compatible avec Node.js</w:t>
+      </w:r>
+    </w:p>
+    <w:p>
+      <w:pPr>
+        <w:tabs>
+          <w:tab w:val="left" w:pos="5172"/>
+        </w:tabs>
+        <w:jc w:val="both"/>
+      </w:pPr>
+      <w:r>
+        <w:t xml:space="preserve">Il vérifie dans un premier temps qu’il s’agit d’une chaîne de caractère puis remplacer le format du hash, le hash reste le même mais il est corrigé afin que cela ne </w:t>
+      </w:r>
+      <w:proofErr w:type="spellStart"/>
+      <w:r>
+        <w:t>crash</w:t>
+      </w:r>
+      <w:proofErr w:type="spellEnd"/>
+      <w:r>
+        <w:t xml:space="preserve"> pas.</w:t>
+      </w:r>
+    </w:p>
+    <w:p>
+      <w:pPr>
+        <w:tabs>
+          <w:tab w:val="left" w:pos="5172"/>
+        </w:tabs>
+        <w:jc w:val="both"/>
+      </w:pPr>
+      <w:r>
+        <w:t xml:space="preserve">Si le caractère n’est pas une chaîne alors on met une chaine vide </w:t>
+      </w:r>
+    </w:p>
+    <w:p>
+      <w:pPr>
+        <w:tabs>
+          <w:tab w:val="left" w:pos="5172"/>
+        </w:tabs>
+        <w:jc w:val="both"/>
+      </w:pPr>
+      <w:r>
+        <w:t xml:space="preserve">Ce code est là pour vérifier que le hash existe et éviter les erreurs avec </w:t>
+      </w:r>
+      <w:proofErr w:type="spellStart"/>
+      <w:r>
+        <w:t>bcrypt</w:t>
+      </w:r>
+      <w:proofErr w:type="spellEnd"/>
+      <w:r>
+        <w:t xml:space="preserve"> </w:t>
+      </w:r>
+    </w:p>
+    <w:p>
+      <w:pPr>
+        <w:tabs>
+          <w:tab w:val="left" w:pos="5172"/>
+        </w:tabs>
+        <w:jc w:val="both"/>
+      </w:pPr>
+      <w:r>
+        <w:drawing>
+          <wp:inline distT="0" distB="0" distL="0" distR="0" wp14:anchorId="3076342E" wp14:editId="41BC9EA7">
+            <wp:extent cx="4858428" cy="590632"/>
+            <wp:effectExtent l="0" t="0" r="0" b="0"/>
+            <wp:docPr id="1655620178" name="Image 1"/>
+            <wp:cNvGraphicFramePr>
+              <a:graphicFrameLocks xmlns:a="http://schemas.openxmlformats.org/drawingml/2006/main" noChangeAspect="1"/>
+            </wp:cNvGraphicFramePr>
+            <a:graphic xmlns:a="http://schemas.openxmlformats.org/drawingml/2006/main">
+              <a:graphicData uri="http://schemas.openxmlformats.org/drawingml/2006/picture">
+                <pic:pic xmlns:pic="http://schemas.openxmlformats.org/drawingml/2006/picture">
+                  <pic:nvPicPr>
+                    <pic:cNvPr id="1655620178" name=""/>
+                    <pic:cNvPicPr/>
+                  </pic:nvPicPr>
+                  <pic:blipFill>
+                    <a:blip r:embed="rId36"/>
+                    <a:stretch>
+                      <a:fillRect/>
+                    </a:stretch>
+                  </pic:blipFill>
+                  <pic:spPr>
+                    <a:xfrm>
+                      <a:off x="0" y="0"/>
+                      <a:ext cx="4858428" cy="590632"/>
+                    </a:xfrm>
+                    <a:prstGeom prst="rect">
+                      <a:avLst/>
+                    </a:prstGeom>
+                  </pic:spPr>
+                </pic:pic>
+              </a:graphicData>
+            </a:graphic>
+          </wp:inline>
+        </w:drawing>
+      </w:r>
+    </w:p>
+    <w:p>
+      <w:pPr>
+        <w:tabs>
+          <w:tab w:val="left" w:pos="5172"/>
+        </w:tabs>
+        <w:jc w:val="both"/>
+      </w:pPr>
+    </w:p>
+    <w:p>
+      <w:pPr>
+        <w:tabs>
+          <w:tab w:val="left" w:pos="5172"/>
+        </w:tabs>
+        <w:jc w:val="both"/>
+      </w:pPr>
+      <w:r>
+        <w:t xml:space="preserve">On vérifie que le mot de passe est valide, donc qu’il soit exact et </w:t>
+      </w:r>
+      <w:proofErr w:type="spellStart"/>
+      <w:r>
+        <w:t>hashé</w:t>
+      </w:r>
+      <w:proofErr w:type="spellEnd"/>
+      <w:r>
+        <w:t xml:space="preserve"> sinon on </w:t>
+      </w:r>
+      <w:proofErr w:type="spellStart"/>
+      <w:r>
+        <w:t>envoit</w:t>
+      </w:r>
+      <w:proofErr w:type="spellEnd"/>
+      <w:r>
+        <w:t xml:space="preserve"> un message d’erreur indiquant qu’il faut refaire la saisie</w:t>
+      </w:r>
+    </w:p>
+    <w:p>
+      <w:pPr>
+        <w:tabs>
+          <w:tab w:val="left" w:pos="5172"/>
+        </w:tabs>
+        <w:jc w:val="both"/>
+      </w:pPr>
+      <w:r>
+        <w:drawing>
+          <wp:inline distT="0" distB="0" distL="0" distR="0" wp14:anchorId="72CB26DA" wp14:editId="58A018BA">
+            <wp:extent cx="5760720" cy="705485"/>
+            <wp:effectExtent l="0" t="0" r="0" b="0"/>
+            <wp:docPr id="369400632" name="Image 1"/>
+            <wp:cNvGraphicFramePr>
+              <a:graphicFrameLocks xmlns:a="http://schemas.openxmlformats.org/drawingml/2006/main" noChangeAspect="1"/>
+            </wp:cNvGraphicFramePr>
+            <a:graphic xmlns:a="http://schemas.openxmlformats.org/drawingml/2006/main">
+              <a:graphicData uri="http://schemas.openxmlformats.org/drawingml/2006/picture">
+                <pic:pic xmlns:pic="http://schemas.openxmlformats.org/drawingml/2006/picture">
+                  <pic:nvPicPr>
+                    <pic:cNvPr id="369400632" name=""/>
+                    <pic:cNvPicPr/>
+                  </pic:nvPicPr>
+                  <pic:blipFill>
+                    <a:blip r:embed="rId37"/>
+                    <a:stretch>
+                      <a:fillRect/>
+                    </a:stretch>
+                  </pic:blipFill>
+                  <pic:spPr>
+                    <a:xfrm>
+                      <a:off x="0" y="0"/>
+                      <a:ext cx="5760720" cy="705485"/>
+                    </a:xfrm>
+                    <a:prstGeom prst="rect">
+                      <a:avLst/>
+                    </a:prstGeom>
+                  </pic:spPr>
+                </pic:pic>
+              </a:graphicData>
+            </a:graphic>
+          </wp:inline>
+        </w:drawing>
+      </w:r>
+    </w:p>
+    <w:p>
+      <w:pPr>
+        <w:tabs>
+          <w:tab w:val="left" w:pos="1905"/>
+        </w:tabs>
+      </w:pPr>
+    </w:p>
+    <w:p>
+      <w:pPr>
+        <w:tabs>
+          <w:tab w:val="left" w:pos="5172"/>
+        </w:tabs>
+      </w:pPr>
+      <w:r>
+        <w:t xml:space="preserve">On définit deux variables pour les retours de </w:t>
+      </w:r>
+      <w:proofErr w:type="spellStart"/>
+      <w:r>
+        <w:t>parseRoles</w:t>
+      </w:r>
+      <w:proofErr w:type="spellEnd"/>
+      <w:r>
+        <w:t xml:space="preserve"> et </w:t>
+      </w:r>
+      <w:proofErr w:type="spellStart"/>
+      <w:r>
+        <w:t>resolveAppRole</w:t>
+      </w:r>
+      <w:proofErr w:type="spellEnd"/>
+      <w:r>
+        <w:t xml:space="preserve"> avec les </w:t>
+      </w:r>
+      <w:proofErr w:type="spellStart"/>
+      <w:r>
+        <w:t>roles</w:t>
+      </w:r>
+      <w:proofErr w:type="spellEnd"/>
+      <w:r>
+        <w:t xml:space="preserve"> issus de la base de données pour identifier le bon </w:t>
+      </w:r>
+      <w:proofErr w:type="spellStart"/>
+      <w:r>
+        <w:t>role</w:t>
+      </w:r>
+      <w:proofErr w:type="spellEnd"/>
+      <w:r>
+        <w:t xml:space="preserve"> et permettre l’accès à l’application</w:t>
+      </w:r>
+    </w:p>
+    <w:p>
+      <w:pPr>
+        <w:tabs>
+          <w:tab w:val="left" w:pos="5172"/>
+        </w:tabs>
+      </w:pPr>
+      <w:r>
+        <w:t xml:space="preserve">Si cela se révèle être faux alors on n’autorise pas l’accès, autrement on </w:t>
+      </w:r>
+      <w:proofErr w:type="spellStart"/>
+      <w:r>
+        <w:t>renvoit</w:t>
+      </w:r>
+      <w:proofErr w:type="spellEnd"/>
+      <w:r>
+        <w:t xml:space="preserve"> un succès et l’utilisateur peut se connecter</w:t>
+      </w:r>
+    </w:p>
+    <w:p>
+      <w:pPr>
+        <w:tabs>
+          <w:tab w:val="left" w:pos="5172"/>
+        </w:tabs>
+      </w:pPr>
+      <w:r>
+        <w:lastRenderedPageBreak/>
+        <w:drawing>
+          <wp:inline distT="0" distB="0" distL="0" distR="0" wp14:anchorId="3E64BE9E" wp14:editId="0B1A88CA">
+            <wp:extent cx="5760720" cy="2727960"/>
+            <wp:effectExtent l="0" t="0" r="0" b="0"/>
+            <wp:docPr id="1864115663" name="Image 1"/>
+            <wp:cNvGraphicFramePr>
+              <a:graphicFrameLocks xmlns:a="http://schemas.openxmlformats.org/drawingml/2006/main" noChangeAspect="1"/>
+            </wp:cNvGraphicFramePr>
+            <a:graphic xmlns:a="http://schemas.openxmlformats.org/drawingml/2006/main">
+              <a:graphicData uri="http://schemas.openxmlformats.org/drawingml/2006/picture">
+                <pic:pic xmlns:pic="http://schemas.openxmlformats.org/drawingml/2006/picture">
+                  <pic:nvPicPr>
+                    <pic:cNvPr id="1864115663" name=""/>
+                    <pic:cNvPicPr/>
+                  </pic:nvPicPr>
+                  <pic:blipFill>
+                    <a:blip r:embed="rId38"/>
+                    <a:stretch>
+                      <a:fillRect/>
+                    </a:stretch>
+                  </pic:blipFill>
+                  <pic:spPr>
+                    <a:xfrm>
+                      <a:off x="0" y="0"/>
+                      <a:ext cx="5760720" cy="2727960"/>
+                    </a:xfrm>
+                    <a:prstGeom prst="rect">
+                      <a:avLst/>
+                    </a:prstGeom>
+                  </pic:spPr>
+                </pic:pic>
+              </a:graphicData>
+            </a:graphic>
+          </wp:inline>
+        </w:drawing>
+      </w:r>
+    </w:p>
+    <w:p>
+      <w:pPr>
+        <w:tabs>
+          <w:tab w:val="left" w:pos="5172"/>
+        </w:tabs>
+      </w:pPr>
+    </w:p>
+    <w:p>
+      <w:pPr>
+        <w:tabs>
+          <w:tab w:val="left" w:pos="5172"/>
+        </w:tabs>
       </w:pPr>
     </w:p>
     <w:sectPr>
-      <w:headerReference w:type="default" r:id="rId36"/>
-      <w:footerReference w:type="default" r:id="rId37"/>
+      <w:headerReference w:type="default" r:id="rId39"/>
+      <w:footerReference w:type="default" r:id="rId40"/>
       <w:pgSz w:w="11906" w:h="16838"/>
       <w:pgMar w:top="1417" w:right="1417" w:bottom="1417" w:left="1417" w:header="708" w:footer="708" w:gutter="0"/>
       <w:cols w:space="708"/>

</xml_diff>